<commit_message>
chore(r181): 重生 B 类同步牵动的派生件（.txt / .docx / .pdf 整链）
背景：8040bf7 改了 `新手上云操作手册.md` / `下一步工序清单.md` 的索引计数（40→45、unique 10→12、
集合 25→27），但派生件没跟着重生 —— 门禁三处真红（非误报）：
  · `tools/verify_docx.py` rc=1：docx 计数 md=['12','45'] vs docx=['10','40'] / md=['45'] vs docx=['40']
  · `check_error_codes.js` K12/K13：`.txt` 必须 ≡ 同名 `.md`

重生链（顺序按官方链：.md → .txt（cp）→ .docx（md2docx）→ .pdf（docx2pdf））：
  · 新手上云操作手册.txt / 下一步工序清单.txt —— `cp -f <name>.md <name>.txt`（md5 逐字相等已验）
  · 新手上云操作手册.docx / 下一步工序清单.docx —— `tools/md2docx_portrait.py`（标题沿用原值）
  · 新手上云操作手册.pdf / 下一步工序清单.pdf —— `tools/docx2pdf_word.py`（ok=2 fail=0）

验收：
- `python tools/verify_docx.py` → rc=0（3 份 docx 计数与同名 .md 一致、无旧串残留）
- 三组 md5：`<name>.md` ≡ `<name>.txt`（SMOKETEST_RUNBOOK / 新手上云操作手册 / 下一步工序清单）

责任方：WorkBuddy（派生件链）
</commit_message>
<xml_diff>
--- a/下一步工序清单.docx
+++ b/下一步工序清单.docx
@@ -2339,7 +2339,37 @@
           <w:rFonts w:ascii="Microsoft YaHei" w:hAnsi="Microsoft YaHei" w:eastAsia="Microsoft YaHei"/>
           <w:sz w:val="21"/>
         </w:rPr>
-        <w:t>预期内的**：微信的 SDK 压根不支持用代码建索引，代码里早就留了话（"建不了就记一笔、不阻断"），集合和种子数据照样落库。索引怎么办见下面「工序 5.5」。</w:t>
+        <w:t>预期内的</w:t>
+      </w:r>
+      <w:r>
+        <w:rPr>
+          <w:rFonts w:ascii="Microsoft YaHei" w:hAnsi="Microsoft YaHei" w:eastAsia="Microsoft YaHei"/>
+          <w:b/>
+          <w:sz w:val="21"/>
+        </w:rPr>
+        <w:t>：微信的 SDK 压根不支持用代码建索引，代码里早就留了话（"建不了就记一笔、不阻断"），集合和种子数据照样落库。索引怎么办见下面「工序 5.5」（</w:t>
+      </w:r>
+      <w:r>
+        <w:rPr>
+          <w:rFonts w:ascii="Microsoft YaHei" w:hAnsi="Microsoft YaHei" w:eastAsia="Microsoft YaHei"/>
+          <w:sz w:val="21"/>
+        </w:rPr>
+        <w:t xml:space="preserve">首选脚本化 </w:t>
+      </w:r>
+      <w:r>
+        <w:rPr>
+          <w:rFonts w:ascii="Consolas" w:hAnsi="Consolas" w:eastAsia="Consolas"/>
+          <w:color w:val="B03020"/>
+          <w:sz w:val="20"/>
+        </w:rPr>
+        <w:t>tools/apply_indexes.js</w:t>
+      </w:r>
+      <w:r>
+        <w:rPr>
+          <w:rFonts w:ascii="Microsoft YaHei" w:hAnsi="Microsoft YaHei" w:eastAsia="Microsoft YaHei"/>
+          <w:sz w:val="21"/>
+        </w:rPr>
+        <w:t>，控制台逐条填只是兜底**）。</w:t>
       </w:r>
     </w:p>
     <w:p>
@@ -2633,7 +2663,7 @@
           <w:b/>
           <w:sz w:val="27"/>
         </w:rPr>
-        <w:t>工序 5.5 · 索引 40 条（可延后，上线前必须补）</w:t>
+        <w:t>工序 5.5 · 索引 45 条（可延后，上线前必须补）</w:t>
       </w:r>
     </w:p>
     <w:p>
@@ -2702,7 +2732,7 @@
           <w:rFonts w:ascii="Microsoft YaHei" w:hAnsi="Microsoft YaHei" w:eastAsia="Microsoft YaHei"/>
           <w:sz w:val="21"/>
         </w:rPr>
-        <w:t xml:space="preserve">25 张集合共 </w:t>
+        <w:t xml:space="preserve">27 张集合共 </w:t>
       </w:r>
       <w:r>
         <w:rPr>
@@ -2710,7 +2740,7 @@
           <w:b/>
           <w:sz w:val="21"/>
         </w:rPr>
-        <w:t>40 条索引</w:t>
+        <w:t>45 条索引</w:t>
       </w:r>
       <w:r>
         <w:rPr>
@@ -2780,7 +2810,164 @@
           <w:rFonts w:ascii="Microsoft YaHei" w:hAnsi="Microsoft YaHei" w:eastAsia="Microsoft YaHei"/>
           <w:sz w:val="21"/>
         </w:rPr>
-        <w:t>），只能手工：</w:t>
+        <w:t xml:space="preserve">）⇒ </w:t>
+      </w:r>
+      <w:r>
+        <w:rPr>
+          <w:rFonts w:ascii="Microsoft YaHei" w:hAnsi="Microsoft YaHei" w:eastAsia="Microsoft YaHei"/>
+          <w:b/>
+          <w:sz w:val="21"/>
+        </w:rPr>
+        <w:t>建法三选一，推荐 ①</w:t>
+      </w:r>
+      <w:r>
+        <w:rPr>
+          <w:rFonts w:ascii="Microsoft YaHei" w:hAnsi="Microsoft YaHei" w:eastAsia="Microsoft YaHei"/>
+          <w:sz w:val="21"/>
+        </w:rPr>
+        <w:t>：</w:t>
+      </w:r>
+    </w:p>
+    <w:p>
+      <w:pPr>
+        <w:ind w:left="270"/>
+        <w:shd w:val="clear" w:color="auto" w:fill="F2F2F2"/>
+      </w:pPr>
+      <w:r/>
+      <w:r>
+        <w:rPr>
+          <w:rFonts w:ascii="Microsoft YaHei" w:hAnsi="Microsoft YaHei" w:eastAsia="Microsoft YaHei"/>
+          <w:b/>
+          <w:sz w:val="20"/>
+        </w:rPr>
+        <w:t>① 脚本化（首选 · 需 AppSecret）</w:t>
+      </w:r>
+      <w:r>
+        <w:rPr>
+          <w:rFonts w:ascii="Microsoft YaHei" w:hAnsi="Microsoft YaHei" w:eastAsia="Microsoft YaHei"/>
+          <w:sz w:val="20"/>
+        </w:rPr>
+        <w:t>：</w:t>
+      </w:r>
+      <w:r>
+        <w:rPr>
+          <w:rFonts w:ascii="Consolas" w:hAnsi="Consolas" w:eastAsia="Consolas"/>
+          <w:color w:val="B03020"/>
+          <w:sz w:val="19"/>
+        </w:rPr>
+        <w:t>node tools/apply_indexes.js --apply --secret-file &lt;文件&gt;</w:t>
+      </w:r>
+      <w:r>
+        <w:rPr>
+          <w:rFonts w:ascii="Microsoft YaHei" w:hAnsi="Microsoft YaHei" w:eastAsia="Microsoft YaHei"/>
+          <w:sz w:val="20"/>
+        </w:rPr>
+        <w:t xml:space="preserve"> 走官方 HTTP API </w:t>
+      </w:r>
+      <w:r>
+        <w:rPr>
+          <w:rFonts w:ascii="Consolas" w:hAnsi="Consolas" w:eastAsia="Consolas"/>
+          <w:color w:val="B03020"/>
+          <w:sz w:val="19"/>
+        </w:rPr>
+        <w:t>POST /tcb/updateindex</w:t>
+      </w:r>
+      <w:r>
+        <w:rPr>
+          <w:rFonts w:ascii="Microsoft YaHei" w:hAnsi="Microsoft YaHei" w:eastAsia="Microsoft YaHei"/>
+          <w:sz w:val="20"/>
+        </w:rPr>
+        <w:t>；</w:t>
+      </w:r>
+      <w:r>
+        <w:rPr>
+          <w:rFonts w:ascii="Microsoft YaHei" w:hAnsi="Microsoft YaHei" w:eastAsia="Microsoft YaHei"/>
+          <w:b/>
+          <w:sz w:val="20"/>
+        </w:rPr>
+        <w:t>幂等、可回读</w:t>
+      </w:r>
+      <w:r>
+        <w:rPr>
+          <w:rFonts w:ascii="Microsoft YaHei" w:hAnsi="Microsoft YaHei" w:eastAsia="Microsoft YaHei"/>
+          <w:sz w:val="20"/>
+        </w:rPr>
+        <w:t>、默认 dry-run（</w:t>
+      </w:r>
+      <w:r>
+        <w:rPr>
+          <w:rFonts w:ascii="Consolas" w:hAnsi="Consolas" w:eastAsia="Consolas"/>
+          <w:color w:val="B03020"/>
+          <w:sz w:val="19"/>
+        </w:rPr>
+        <w:t>--apply</w:t>
+      </w:r>
+      <w:r>
+        <w:rPr>
+          <w:rFonts w:ascii="Microsoft YaHei" w:hAnsi="Microsoft YaHei" w:eastAsia="Microsoft YaHei"/>
+          <w:sz w:val="20"/>
+        </w:rPr>
+        <w:t xml:space="preserve"> 才真写）。 </w:t>
+      </w:r>
+      <w:r>
+        <w:rPr>
+          <w:rFonts w:ascii="Microsoft YaHei" w:hAnsi="Microsoft YaHei" w:eastAsia="Microsoft YaHei"/>
+          <w:b/>
+          <w:sz w:val="20"/>
+        </w:rPr>
+        <w:t>② GUI 键鼠自动驾驶（无需密钥）</w:t>
+      </w:r>
+      <w:r>
+        <w:rPr>
+          <w:rFonts w:ascii="Microsoft YaHei" w:hAnsi="Microsoft YaHei" w:eastAsia="Microsoft YaHei"/>
+          <w:sz w:val="20"/>
+        </w:rPr>
+        <w:t xml:space="preserve">：2026-09-17 实证 </w:t>
+      </w:r>
+      <w:r>
+        <w:rPr>
+          <w:rFonts w:ascii="Microsoft YaHei" w:hAnsi="Microsoft YaHei" w:eastAsia="Microsoft YaHei"/>
+          <w:b/>
+          <w:sz w:val="20"/>
+        </w:rPr>
+        <w:t>40/40 全量建成</w:t>
+      </w:r>
+      <w:r>
+        <w:rPr>
+          <w:rFonts w:ascii="Microsoft YaHei" w:hAnsi="Microsoft YaHei" w:eastAsia="Microsoft YaHei"/>
+          <w:sz w:val="20"/>
+        </w:rPr>
+        <w:t xml:space="preserve">； 脚本见 </w:t>
+      </w:r>
+      <w:r>
+        <w:rPr>
+          <w:rFonts w:ascii="Consolas" w:hAnsi="Consolas" w:eastAsia="Consolas"/>
+          <w:color w:val="B03020"/>
+          <w:sz w:val="19"/>
+        </w:rPr>
+        <w:t>review/evidence/index_buildout_20260917/scripts/</w:t>
+      </w:r>
+      <w:r>
+        <w:rPr>
+          <w:rFonts w:ascii="Microsoft YaHei" w:hAnsi="Microsoft YaHei" w:eastAsia="Microsoft YaHei"/>
+          <w:sz w:val="20"/>
+        </w:rPr>
+        <w:t xml:space="preserve">（需开着微信开发者工具）。 </w:t>
+      </w:r>
+      <w:r>
+        <w:rPr>
+          <w:rFonts w:ascii="Microsoft YaHei" w:hAnsi="Microsoft YaHei" w:eastAsia="Microsoft YaHei"/>
+          <w:b/>
+          <w:sz w:val="20"/>
+        </w:rPr>
+        <w:t>③ 控制台逐条手填（前两条都走不了时）</w:t>
+      </w:r>
+      <w:r>
+        <w:rPr>
+          <w:rFonts w:ascii="Microsoft YaHei" w:hAnsi="Microsoft YaHei" w:eastAsia="Microsoft YaHei"/>
+          <w:sz w:val="20"/>
+        </w:rPr>
+        <w:t>：按下述三步 + 下方逐条对照表。</w:t>
       </w:r>
     </w:p>
     <w:p>
@@ -2790,37 +2977,7 @@
           <w:rFonts w:ascii="Microsoft YaHei" w:hAnsi="Microsoft YaHei" w:eastAsia="Microsoft YaHei"/>
           <w:sz w:val="21"/>
         </w:rPr>
-        <w:t>1. 云开发控制台 →「数据库」→ 点开某个集合 →「</w:t>
-      </w:r>
-      <w:r>
-        <w:rPr>
-          <w:rFonts w:ascii="Microsoft YaHei" w:hAnsi="Microsoft YaHei" w:eastAsia="Microsoft YaHei"/>
-          <w:b/>
-          <w:sz w:val="21"/>
-        </w:rPr>
-        <w:t>索引管理</w:t>
-      </w:r>
-      <w:r>
-        <w:rPr>
-          <w:rFonts w:ascii="Microsoft YaHei" w:hAnsi="Microsoft YaHei" w:eastAsia="Microsoft YaHei"/>
-          <w:sz w:val="21"/>
-        </w:rPr>
-        <w:t>」→「</w:t>
-      </w:r>
-      <w:r>
-        <w:rPr>
-          <w:rFonts w:ascii="Microsoft YaHei" w:hAnsi="Microsoft YaHei" w:eastAsia="Microsoft YaHei"/>
-          <w:b/>
-          <w:sz w:val="21"/>
-        </w:rPr>
-        <w:t>添加索引</w:t>
-      </w:r>
-      <w:r>
-        <w:rPr>
-          <w:rFonts w:ascii="Microsoft YaHei" w:hAnsi="Microsoft YaHei" w:eastAsia="Microsoft YaHei"/>
-          <w:sz w:val="21"/>
-        </w:rPr>
-        <w:t>」。</w:t>
+        <w:t>③ 的操作：</w:t>
       </w:r>
     </w:p>
     <w:p>
@@ -2830,6 +2987,46 @@
           <w:rFonts w:ascii="Microsoft YaHei" w:hAnsi="Microsoft YaHei" w:eastAsia="Microsoft YaHei"/>
           <w:sz w:val="21"/>
         </w:rPr>
+        <w:t>1. 云开发控制台 →「数据库」→ 点开某个集合 →「</w:t>
+      </w:r>
+      <w:r>
+        <w:rPr>
+          <w:rFonts w:ascii="Microsoft YaHei" w:hAnsi="Microsoft YaHei" w:eastAsia="Microsoft YaHei"/>
+          <w:b/>
+          <w:sz w:val="21"/>
+        </w:rPr>
+        <w:t>索引管理</w:t>
+      </w:r>
+      <w:r>
+        <w:rPr>
+          <w:rFonts w:ascii="Microsoft YaHei" w:hAnsi="Microsoft YaHei" w:eastAsia="Microsoft YaHei"/>
+          <w:sz w:val="21"/>
+        </w:rPr>
+        <w:t>」→「</w:t>
+      </w:r>
+      <w:r>
+        <w:rPr>
+          <w:rFonts w:ascii="Microsoft YaHei" w:hAnsi="Microsoft YaHei" w:eastAsia="Microsoft YaHei"/>
+          <w:b/>
+          <w:sz w:val="21"/>
+        </w:rPr>
+        <w:t>添加索引</w:t>
+      </w:r>
+      <w:r>
+        <w:rPr>
+          <w:rFonts w:ascii="Microsoft YaHei" w:hAnsi="Microsoft YaHei" w:eastAsia="Microsoft YaHei"/>
+          <w:sz w:val="21"/>
+        </w:rPr>
+        <w:t>」。</w:t>
+      </w:r>
+    </w:p>
+    <w:p>
+      <w:r/>
+      <w:r>
+        <w:rPr>
+          <w:rFonts w:ascii="Microsoft YaHei" w:hAnsi="Microsoft YaHei" w:eastAsia="Microsoft YaHei"/>
+          <w:sz w:val="21"/>
+        </w:rPr>
         <w:t xml:space="preserve">2. 按 </w:t>
       </w:r>
       <w:r>
@@ -2870,7 +3067,7 @@
           <w:rFonts w:ascii="Microsoft YaHei" w:hAnsi="Microsoft YaHei" w:eastAsia="Microsoft YaHei"/>
           <w:sz w:val="21"/>
         </w:rPr>
-        <w:t>3. 逐条重复 40 次。</w:t>
+        <w:t>3. 逐条重复 45 次。</w:t>
       </w:r>
     </w:p>
     <w:p>
@@ -2880,7 +3077,7 @@
           <w:rFonts w:ascii="Microsoft YaHei" w:hAnsi="Microsoft YaHei" w:eastAsia="Microsoft YaHei"/>
           <w:sz w:val="21"/>
         </w:rPr>
-        <w:t>⚠️ 枯燥但绕不开。下面是</w:t>
+        <w:t xml:space="preserve">⚠️ 枯燥 —— </w:t>
       </w:r>
       <w:r>
         <w:rPr>
@@ -2888,6 +3085,31 @@
           <w:b/>
           <w:sz w:val="21"/>
         </w:rPr>
+        <w:t>有 AppSecret 就走 ①，别走 ③</w:t>
+      </w:r>
+      <w:r>
+        <w:rPr>
+          <w:rFonts w:ascii="Microsoft YaHei" w:hAnsi="Microsoft YaHei" w:eastAsia="Microsoft YaHei"/>
+          <w:sz w:val="21"/>
+        </w:rPr>
+        <w:t>（旧版这里写「只能手工」，已于 2026-09-17 证伪并改正）。</w:t>
+      </w:r>
+    </w:p>
+    <w:p>
+      <w:r/>
+      <w:r>
+        <w:rPr>
+          <w:rFonts w:ascii="Microsoft YaHei" w:hAnsi="Microsoft YaHei" w:eastAsia="Microsoft YaHei"/>
+          <w:sz w:val="21"/>
+        </w:rPr>
+        <w:t>下面是</w:t>
+      </w:r>
+      <w:r>
+        <w:rPr>
+          <w:rFonts w:ascii="Microsoft YaHei" w:hAnsi="Microsoft YaHei" w:eastAsia="Microsoft YaHei"/>
+          <w:b/>
+          <w:sz w:val="21"/>
+        </w:rPr>
         <w:t>逐条对照表</w:t>
       </w:r>
       <w:r>
@@ -2895,7 +3117,7 @@
           <w:rFonts w:ascii="Microsoft YaHei" w:hAnsi="Microsoft YaHei" w:eastAsia="Microsoft YaHei"/>
           <w:sz w:val="21"/>
         </w:rPr>
-        <w:t>（共 40 条；</w:t>
+        <w:t>（共 45 条；</w:t>
       </w:r>
       <w:r>
         <w:rPr>
@@ -4483,7 +4705,7 @@
                 <w:rFonts w:ascii="Microsoft YaHei" w:hAnsi="Microsoft YaHei" w:eastAsia="Microsoft YaHei"/>
                 <w:sz w:val="19"/>
               </w:rPr>
-              <w:t>idx_line_card</w:t>
+              <w:t>idx_line_row</w:t>
             </w:r>
           </w:p>
         </w:tc>
@@ -4498,7 +4720,7 @@
                 <w:rFonts w:ascii="Microsoft YaHei" w:hAnsi="Microsoft YaHei" w:eastAsia="Microsoft YaHei"/>
                 <w:sz w:val="19"/>
               </w:rPr>
-              <w:t>card_id ↑</w:t>
+              <w:t>shop_id ↑, cost_card_row_id ↑</w:t>
             </w:r>
           </w:p>
         </w:tc>
@@ -5915,6 +6137,372 @@
                 <w:sz w:val="19"/>
               </w:rPr>
               <w:t>shop_id ↑, month ↑</w:t>
+            </w:r>
+          </w:p>
+        </w:tc>
+        <w:tc>
+          <w:tcPr>
+            <w:tcW w:type="dxa" w:w="1973"/>
+          </w:tcPr>
+          <w:p>
+            <w:r/>
+          </w:p>
+        </w:tc>
+      </w:tr>
+      <w:tr>
+        <w:tc>
+          <w:tcPr>
+            <w:tcW w:type="dxa" w:w="1973"/>
+          </w:tcPr>
+          <w:p>
+            <w:r/>
+            <w:r>
+              <w:rPr>
+                <w:rFonts w:ascii="Microsoft YaHei" w:hAnsi="Microsoft YaHei" w:eastAsia="Microsoft YaHei"/>
+                <w:sz w:val="19"/>
+              </w:rPr>
+              <w:t>41</w:t>
+            </w:r>
+          </w:p>
+        </w:tc>
+        <w:tc>
+          <w:tcPr>
+            <w:tcW w:type="dxa" w:w="1973"/>
+          </w:tcPr>
+          <w:p>
+            <w:r/>
+            <w:r>
+              <w:rPr>
+                <w:rFonts w:ascii="Microsoft YaHei" w:hAnsi="Microsoft YaHei" w:eastAsia="Microsoft YaHei"/>
+                <w:sz w:val="19"/>
+              </w:rPr>
+              <w:t>external_sales_daily</w:t>
+            </w:r>
+          </w:p>
+        </w:tc>
+        <w:tc>
+          <w:tcPr>
+            <w:tcW w:type="dxa" w:w="1973"/>
+          </w:tcPr>
+          <w:p>
+            <w:r/>
+            <w:r>
+              <w:rPr>
+                <w:rFonts w:ascii="Microsoft YaHei" w:hAnsi="Microsoft YaHei" w:eastAsia="Microsoft YaHei"/>
+                <w:sz w:val="19"/>
+              </w:rPr>
+              <w:t>idx_esd_uniq</w:t>
+            </w:r>
+          </w:p>
+        </w:tc>
+        <w:tc>
+          <w:tcPr>
+            <w:tcW w:type="dxa" w:w="1973"/>
+          </w:tcPr>
+          <w:p>
+            <w:r/>
+            <w:r>
+              <w:rPr>
+                <w:rFonts w:ascii="Microsoft YaHei" w:hAnsi="Microsoft YaHei" w:eastAsia="Microsoft YaHei"/>
+                <w:sz w:val="19"/>
+              </w:rPr>
+              <w:t>shop_id ↑, biz_date ↑, external_ref_id ↑</w:t>
+            </w:r>
+          </w:p>
+        </w:tc>
+        <w:tc>
+          <w:tcPr>
+            <w:tcW w:type="dxa" w:w="1973"/>
+          </w:tcPr>
+          <w:p>
+            <w:r/>
+            <w:r>
+              <w:rPr>
+                <w:rFonts w:ascii="Microsoft YaHei" w:hAnsi="Microsoft YaHei" w:eastAsia="Microsoft YaHei"/>
+                <w:b/>
+                <w:sz w:val="19"/>
+              </w:rPr>
+              <w:t>【唯一】</w:t>
+            </w:r>
+          </w:p>
+        </w:tc>
+      </w:tr>
+      <w:tr>
+        <w:tc>
+          <w:tcPr>
+            <w:tcW w:type="dxa" w:w="1973"/>
+          </w:tcPr>
+          <w:p>
+            <w:r/>
+            <w:r>
+              <w:rPr>
+                <w:rFonts w:ascii="Microsoft YaHei" w:hAnsi="Microsoft YaHei" w:eastAsia="Microsoft YaHei"/>
+                <w:sz w:val="19"/>
+              </w:rPr>
+              <w:t>42</w:t>
+            </w:r>
+          </w:p>
+        </w:tc>
+        <w:tc>
+          <w:tcPr>
+            <w:tcW w:type="dxa" w:w="1973"/>
+          </w:tcPr>
+          <w:p>
+            <w:r/>
+            <w:r>
+              <w:rPr>
+                <w:rFonts w:ascii="Microsoft YaHei" w:hAnsi="Microsoft YaHei" w:eastAsia="Microsoft YaHei"/>
+                <w:sz w:val="19"/>
+              </w:rPr>
+              <w:t>external_sales_daily</w:t>
+            </w:r>
+          </w:p>
+        </w:tc>
+        <w:tc>
+          <w:tcPr>
+            <w:tcW w:type="dxa" w:w="1973"/>
+          </w:tcPr>
+          <w:p>
+            <w:r/>
+            <w:r>
+              <w:rPr>
+                <w:rFonts w:ascii="Microsoft YaHei" w:hAnsi="Microsoft YaHei" w:eastAsia="Microsoft YaHei"/>
+                <w:sz w:val="19"/>
+              </w:rPr>
+              <w:t>idx_esd_shop_date</w:t>
+            </w:r>
+          </w:p>
+        </w:tc>
+        <w:tc>
+          <w:tcPr>
+            <w:tcW w:type="dxa" w:w="1973"/>
+          </w:tcPr>
+          <w:p>
+            <w:r/>
+            <w:r>
+              <w:rPr>
+                <w:rFonts w:ascii="Microsoft YaHei" w:hAnsi="Microsoft YaHei" w:eastAsia="Microsoft YaHei"/>
+                <w:sz w:val="19"/>
+              </w:rPr>
+              <w:t>shop_id ↑, biz_date ↑</w:t>
+            </w:r>
+          </w:p>
+        </w:tc>
+        <w:tc>
+          <w:tcPr>
+            <w:tcW w:type="dxa" w:w="1973"/>
+          </w:tcPr>
+          <w:p>
+            <w:r/>
+          </w:p>
+        </w:tc>
+      </w:tr>
+      <w:tr>
+        <w:tc>
+          <w:tcPr>
+            <w:tcW w:type="dxa" w:w="1973"/>
+          </w:tcPr>
+          <w:p>
+            <w:r/>
+            <w:r>
+              <w:rPr>
+                <w:rFonts w:ascii="Microsoft YaHei" w:hAnsi="Microsoft YaHei" w:eastAsia="Microsoft YaHei"/>
+                <w:sz w:val="19"/>
+              </w:rPr>
+              <w:t>43</w:t>
+            </w:r>
+          </w:p>
+        </w:tc>
+        <w:tc>
+          <w:tcPr>
+            <w:tcW w:type="dxa" w:w="1973"/>
+          </w:tcPr>
+          <w:p>
+            <w:r/>
+            <w:r>
+              <w:rPr>
+                <w:rFonts w:ascii="Microsoft YaHei" w:hAnsi="Microsoft YaHei" w:eastAsia="Microsoft YaHei"/>
+                <w:sz w:val="19"/>
+              </w:rPr>
+              <w:t>external_sales_daily</w:t>
+            </w:r>
+          </w:p>
+        </w:tc>
+        <w:tc>
+          <w:tcPr>
+            <w:tcW w:type="dxa" w:w="1973"/>
+          </w:tcPr>
+          <w:p>
+            <w:r/>
+            <w:r>
+              <w:rPr>
+                <w:rFonts w:ascii="Microsoft YaHei" w:hAnsi="Microsoft YaHei" w:eastAsia="Microsoft YaHei"/>
+                <w:sz w:val="19"/>
+              </w:rPr>
+              <w:t>idx_esd_dish_key</w:t>
+            </w:r>
+          </w:p>
+        </w:tc>
+        <w:tc>
+          <w:tcPr>
+            <w:tcW w:type="dxa" w:w="1973"/>
+          </w:tcPr>
+          <w:p>
+            <w:r/>
+            <w:r>
+              <w:rPr>
+                <w:rFonts w:ascii="Microsoft YaHei" w:hAnsi="Microsoft YaHei" w:eastAsia="Microsoft YaHei"/>
+                <w:sz w:val="19"/>
+              </w:rPr>
+              <w:t>shop_id ↑, dish_key ↑</w:t>
+            </w:r>
+          </w:p>
+        </w:tc>
+        <w:tc>
+          <w:tcPr>
+            <w:tcW w:type="dxa" w:w="1973"/>
+          </w:tcPr>
+          <w:p>
+            <w:r/>
+          </w:p>
+        </w:tc>
+      </w:tr>
+      <w:tr>
+        <w:tc>
+          <w:tcPr>
+            <w:tcW w:type="dxa" w:w="1973"/>
+          </w:tcPr>
+          <w:p>
+            <w:r/>
+            <w:r>
+              <w:rPr>
+                <w:rFonts w:ascii="Microsoft YaHei" w:hAnsi="Microsoft YaHei" w:eastAsia="Microsoft YaHei"/>
+                <w:sz w:val="19"/>
+              </w:rPr>
+              <w:t>44</w:t>
+            </w:r>
+          </w:p>
+        </w:tc>
+        <w:tc>
+          <w:tcPr>
+            <w:tcW w:type="dxa" w:w="1973"/>
+          </w:tcPr>
+          <w:p>
+            <w:r/>
+            <w:r>
+              <w:rPr>
+                <w:rFonts w:ascii="Microsoft YaHei" w:hAnsi="Microsoft YaHei" w:eastAsia="Microsoft YaHei"/>
+                <w:sz w:val="19"/>
+              </w:rPr>
+              <w:t>shop_dish_mapping</w:t>
+            </w:r>
+          </w:p>
+        </w:tc>
+        <w:tc>
+          <w:tcPr>
+            <w:tcW w:type="dxa" w:w="1973"/>
+          </w:tcPr>
+          <w:p>
+            <w:r/>
+            <w:r>
+              <w:rPr>
+                <w:rFonts w:ascii="Microsoft YaHei" w:hAnsi="Microsoft YaHei" w:eastAsia="Microsoft YaHei"/>
+                <w:sz w:val="19"/>
+              </w:rPr>
+              <w:t>idx_dm_uniq</w:t>
+            </w:r>
+          </w:p>
+        </w:tc>
+        <w:tc>
+          <w:tcPr>
+            <w:tcW w:type="dxa" w:w="1973"/>
+          </w:tcPr>
+          <w:p>
+            <w:r/>
+            <w:r>
+              <w:rPr>
+                <w:rFonts w:ascii="Microsoft YaHei" w:hAnsi="Microsoft YaHei" w:eastAsia="Microsoft YaHei"/>
+                <w:sz w:val="19"/>
+              </w:rPr>
+              <w:t>shop_id ↑, platform ↑, external_ref_id ↑</w:t>
+            </w:r>
+          </w:p>
+        </w:tc>
+        <w:tc>
+          <w:tcPr>
+            <w:tcW w:type="dxa" w:w="1973"/>
+          </w:tcPr>
+          <w:p>
+            <w:r/>
+            <w:r>
+              <w:rPr>
+                <w:rFonts w:ascii="Microsoft YaHei" w:hAnsi="Microsoft YaHei" w:eastAsia="Microsoft YaHei"/>
+                <w:b/>
+                <w:sz w:val="19"/>
+              </w:rPr>
+              <w:t>【唯一】</w:t>
+            </w:r>
+          </w:p>
+        </w:tc>
+      </w:tr>
+      <w:tr>
+        <w:tc>
+          <w:tcPr>
+            <w:tcW w:type="dxa" w:w="1973"/>
+          </w:tcPr>
+          <w:p>
+            <w:r/>
+            <w:r>
+              <w:rPr>
+                <w:rFonts w:ascii="Microsoft YaHei" w:hAnsi="Microsoft YaHei" w:eastAsia="Microsoft YaHei"/>
+                <w:sz w:val="19"/>
+              </w:rPr>
+              <w:t>45</w:t>
+            </w:r>
+          </w:p>
+        </w:tc>
+        <w:tc>
+          <w:tcPr>
+            <w:tcW w:type="dxa" w:w="1973"/>
+          </w:tcPr>
+          <w:p>
+            <w:r/>
+            <w:r>
+              <w:rPr>
+                <w:rFonts w:ascii="Microsoft YaHei" w:hAnsi="Microsoft YaHei" w:eastAsia="Microsoft YaHei"/>
+                <w:sz w:val="19"/>
+              </w:rPr>
+              <w:t>shop_dish_mapping</w:t>
+            </w:r>
+          </w:p>
+        </w:tc>
+        <w:tc>
+          <w:tcPr>
+            <w:tcW w:type="dxa" w:w="1973"/>
+          </w:tcPr>
+          <w:p>
+            <w:r/>
+            <w:r>
+              <w:rPr>
+                <w:rFonts w:ascii="Microsoft YaHei" w:hAnsi="Microsoft YaHei" w:eastAsia="Microsoft YaHei"/>
+                <w:sz w:val="19"/>
+              </w:rPr>
+              <w:t>idx_dm_card_code</w:t>
+            </w:r>
+          </w:p>
+        </w:tc>
+        <w:tc>
+          <w:tcPr>
+            <w:tcW w:type="dxa" w:w="1973"/>
+          </w:tcPr>
+          <w:p>
+            <w:r/>
+            <w:r>
+              <w:rPr>
+                <w:rFonts w:ascii="Microsoft YaHei" w:hAnsi="Microsoft YaHei" w:eastAsia="Microsoft YaHei"/>
+                <w:sz w:val="19"/>
+              </w:rPr>
+              <w:t>shop_id ↑, card_code ↑</w:t>
             </w:r>
           </w:p>
         </w:tc>
@@ -6000,7 +6588,7 @@
           <w:rFonts w:ascii="Microsoft YaHei" w:hAnsi="Microsoft YaHei" w:eastAsia="Microsoft YaHei"/>
           <w:sz w:val="20"/>
         </w:rPr>
-        <w:t>。它不是唯一索引 ⇒ 上表「10 条 unique」清单不变。</w:t>
+        <w:t>。它不是唯一索引 ⇒ 不进上表的 unique 清单（R174 后该清单共 12 条，与本条无关）。</w:t>
       </w:r>
     </w:p>
     <w:p/>
@@ -7644,7 +8232,22 @@
                 <w:rFonts w:ascii="Microsoft YaHei" w:hAnsi="Microsoft YaHei" w:eastAsia="Microsoft YaHei"/>
                 <w:sz w:val="19"/>
               </w:rPr>
-              <w:t>，不影响建表；上线前走「工序 5.5」手工补</w:t>
+              <w:t xml:space="preserve">，不影响建表；上线前走「工序 5.5」补（首选 </w:t>
+            </w:r>
+            <w:r>
+              <w:rPr>
+                <w:rFonts w:ascii="Consolas" w:hAnsi="Consolas" w:eastAsia="Consolas"/>
+                <w:color w:val="B03020"/>
+                <w:sz w:val="18"/>
+              </w:rPr>
+              <w:t>tools/apply_indexes.js</w:t>
+            </w:r>
+            <w:r>
+              <w:rPr>
+                <w:rFonts w:ascii="Microsoft YaHei" w:hAnsi="Microsoft YaHei" w:eastAsia="Microsoft YaHei"/>
+                <w:sz w:val="19"/>
+              </w:rPr>
+              <w:t>，控制台逐条填是兜底）</w:t>
             </w:r>
           </w:p>
         </w:tc>

</xml_diff>